<commit_message>
Phase 1 Änderungen, AktiveUser, Nummernvergaben LS/BS, DoCmd SetWarnings entfernen etc.
</commit_message>
<xml_diff>
--- a/Entwicklung 2026.docx
+++ b/Entwicklung 2026.docx
@@ -305,7 +305,7 @@
     <w:p>
       <w:r>
         <w:pict w14:anchorId="55CE9C0D">
-          <v:rect id="_x0000_i1103" style="width:0;height:1.5pt" o:hralign="center" o:hrstd="t" o:hr="t" fillcolor="#a0a0a0" stroked="f"/>
+          <v:rect id="_x0000_i1025" style="width:0;height:1.5pt" o:hralign="center" o:hrstd="t" o:hr="t" fillcolor="#a0a0a0" stroked="f"/>
         </w:pict>
       </w:r>
     </w:p>
@@ -529,7 +529,7 @@
     <w:p>
       <w:r>
         <w:pict w14:anchorId="7245818D">
-          <v:rect id="_x0000_i1104" style="width:0;height:1.5pt" o:hralign="center" o:hrstd="t" o:hr="t" fillcolor="#a0a0a0" stroked="f"/>
+          <v:rect id="_x0000_i1026" style="width:0;height:1.5pt" o:hralign="center" o:hrstd="t" o:hr="t" fillcolor="#a0a0a0" stroked="f"/>
         </w:pict>
       </w:r>
     </w:p>
@@ -790,7 +790,7 @@
     <w:p>
       <w:r>
         <w:pict w14:anchorId="6F87EE76">
-          <v:rect id="_x0000_i1105" style="width:0;height:1.5pt" o:hralign="center" o:hrstd="t" o:hr="t" fillcolor="#a0a0a0" stroked="f"/>
+          <v:rect id="_x0000_i1027" style="width:0;height:1.5pt" o:hralign="center" o:hrstd="t" o:hr="t" fillcolor="#a0a0a0" stroked="f"/>
         </w:pict>
       </w:r>
     </w:p>
@@ -992,7 +992,7 @@
     <w:p>
       <w:r>
         <w:pict w14:anchorId="4CD428F7">
-          <v:rect id="_x0000_i1106" style="width:0;height:1.5pt" o:hralign="center" o:hrstd="t" o:hr="t" fillcolor="#a0a0a0" stroked="f"/>
+          <v:rect id="_x0000_i1028" style="width:0;height:1.5pt" o:hralign="center" o:hrstd="t" o:hr="t" fillcolor="#a0a0a0" stroked="f"/>
         </w:pict>
       </w:r>
     </w:p>
@@ -1099,7 +1099,7 @@
     <w:p>
       <w:r>
         <w:pict w14:anchorId="02346E91">
-          <v:rect id="_x0000_i1107" style="width:0;height:1.5pt" o:hralign="center" o:hrstd="t" o:hr="t" fillcolor="#a0a0a0" stroked="f"/>
+          <v:rect id="_x0000_i1029" style="width:0;height:1.5pt" o:hralign="center" o:hrstd="t" o:hr="t" fillcolor="#a0a0a0" stroked="f"/>
         </w:pict>
       </w:r>
     </w:p>
@@ -1266,7 +1266,7 @@
     <w:p>
       <w:r>
         <w:pict w14:anchorId="30825431">
-          <v:rect id="_x0000_i1108" style="width:0;height:1.5pt" o:hralign="center" o:hrstd="t" o:hr="t" fillcolor="#a0a0a0" stroked="f"/>
+          <v:rect id="_x0000_i1030" style="width:0;height:1.5pt" o:hralign="center" o:hrstd="t" o:hr="t" fillcolor="#a0a0a0" stroked="f"/>
         </w:pict>
       </w:r>
     </w:p>
@@ -1402,7 +1402,7 @@
     <w:p>
       <w:r>
         <w:pict w14:anchorId="12E4B964">
-          <v:rect id="_x0000_i1109" style="width:0;height:1.5pt" o:hralign="center" o:hrstd="t" o:hr="t" fillcolor="#a0a0a0" stroked="f"/>
+          <v:rect id="_x0000_i1031" style="width:0;height:1.5pt" o:hralign="center" o:hrstd="t" o:hr="t" fillcolor="#a0a0a0" stroked="f"/>
         </w:pict>
       </w:r>
     </w:p>
@@ -1515,7 +1515,7 @@
     <w:p>
       <w:r>
         <w:pict w14:anchorId="6BA8F6C9">
-          <v:rect id="_x0000_i1110" style="width:0;height:1.5pt" o:hralign="center" o:hrstd="t" o:hr="t" fillcolor="#a0a0a0" stroked="f"/>
+          <v:rect id="_x0000_i1032" style="width:0;height:1.5pt" o:hralign="center" o:hrstd="t" o:hr="t" fillcolor="#a0a0a0" stroked="f"/>
         </w:pict>
       </w:r>
     </w:p>
@@ -1622,7 +1622,7 @@
     <w:p>
       <w:r>
         <w:pict w14:anchorId="4C106578">
-          <v:rect id="_x0000_i1111" style="width:0;height:1.5pt" o:hralign="center" o:hrstd="t" o:hr="t" fillcolor="#a0a0a0" stroked="f"/>
+          <v:rect id="_x0000_i1033" style="width:0;height:1.5pt" o:hralign="center" o:hrstd="t" o:hr="t" fillcolor="#a0a0a0" stroked="f"/>
         </w:pict>
       </w:r>
     </w:p>
@@ -1755,7 +1755,7 @@
     <w:p>
       <w:r>
         <w:pict w14:anchorId="2C118E87">
-          <v:rect id="_x0000_i1112" style="width:0;height:1.5pt" o:hralign="center" o:hrstd="t" o:hr="t" fillcolor="#a0a0a0" stroked="f"/>
+          <v:rect id="_x0000_i1034" style="width:0;height:1.5pt" o:hralign="center" o:hrstd="t" o:hr="t" fillcolor="#a0a0a0" stroked="f"/>
         </w:pict>
       </w:r>
     </w:p>
@@ -1860,7 +1860,7 @@
     <w:p>
       <w:r>
         <w:pict w14:anchorId="38959408">
-          <v:rect id="_x0000_i1113" style="width:0;height:1.5pt" o:hralign="center" o:hrstd="t" o:hr="t" fillcolor="#a0a0a0" stroked="f"/>
+          <v:rect id="_x0000_i1035" style="width:0;height:1.5pt" o:hralign="center" o:hrstd="t" o:hr="t" fillcolor="#a0a0a0" stroked="f"/>
         </w:pict>
       </w:r>
     </w:p>
@@ -1944,7 +1944,7 @@
     <w:p>
       <w:r>
         <w:pict w14:anchorId="5D5CB937">
-          <v:rect id="_x0000_i1114" style="width:0;height:1.5pt" o:hralign="center" o:hrstd="t" o:hr="t" fillcolor="#a0a0a0" stroked="f"/>
+          <v:rect id="_x0000_i1036" style="width:0;height:1.5pt" o:hralign="center" o:hrstd="t" o:hr="t" fillcolor="#a0a0a0" stroked="f"/>
         </w:pict>
       </w:r>
     </w:p>
@@ -6514,6 +6514,7 @@
   <w:style w:type="character" w:default="1" w:styleId="Absatz-Standardschriftart">
     <w:name w:val="Default Paragraph Font"/>
     <w:uiPriority w:val="1"/>
+    <w:semiHidden/>
     <w:unhideWhenUsed/>
   </w:style>
   <w:style w:type="table" w:default="1" w:styleId="NormaleTabelle">

</xml_diff>